<commit_message>
Prepare v0.0.1 Blaze of Glory
Security:
- Pass variables to shell steps and command conditions in the
  environment, so a file name, clipboard text or webhook body can't run
- Refuse self-referencing conditions and malformed shared files
- Stop option-like schedules passing validation, and non-ASCII tokens
  causing a server error
- Keep run history private, and raise dependency floors past known CVEs

Features: add a window action, niri support for focus_app, and an About
section in Settings.

Fixes: close each shell step's output pipe and the app's per-request
database connections, and stop undo skipping a step or losing redo.

Project: add the MIT license, CI, front-end tests, an AUR package,
AGENTS.md and todo.md, and bring the design doc up to date.

Co-Authored-By: Claude Opus 5.5 <noreply@anthropic.com>
</commit_message>
<xml_diff>
--- a/docs/CronJovi-Design-Document.docx
+++ b/docs/CronJovi-Design-Document.docx
@@ -46,7 +46,7 @@
           <w:sz w:val="20"/>
           <w:szCs w:val="20"/>
         </w:rPr>
-        <w:t xml:space="preserve">Author: Justin Garza   ·   Status: Draft v0.1   ·   October 30, 2026</w:t>
+        <w:t>Author: Justin Garza   ·   Status: Current for v0.0.1   ·   October 31, 2026</w:t>
       </w:r>
     </w:p>
     <w:p>
@@ -1010,7 +1010,7 @@
           <w:sz w:val="22"/>
           <w:szCs w:val="22"/>
         </w:rPr>
-        <w:t xml:space="preserve">A GTK4/libadwaita app or local web UI (Flask + Bootstrap) with a block editor. It reads and writes the same YAML.</w:t>
+        <w:t>A local web UI (Flask and plain JavaScript) in a WebKitGTK window, with a block editor. It reads and writes the same YAML.</w:t>
       </w:r>
     </w:p>
     <w:p>
@@ -1609,7 +1609,7 @@
           <w:sz w:val="26"/>
           <w:szCs w:val="26"/>
         </w:rPr>
-        <w:t xml:space="preserve">4.3 Starter actions (about 10)</w:t>
+        <w:t>4.3 First actions (21 ship in v0.0.1)</w:t>
       </w:r>
     </w:p>
     <w:tbl>
@@ -3360,7 +3360,7 @@
           <w:sz w:val="22"/>
           <w:szCs w:val="22"/>
         </w:rPr>
-        <w:t xml:space="preserve">About 10 actions (section 4.3).</w:t>
+        <w:t>21 actions (section 4.3).</w:t>
       </w:r>
     </w:p>
     <w:p>
@@ -3445,7 +3445,7 @@
           <w:sz w:val="26"/>
           <w:szCs w:val="26"/>
         </w:rPr>
-        <w:t xml:space="preserve">Later</w:t>
+        <w:t>Later (all shipped in v0.0.1)</w:t>
       </w:r>
     </w:p>
     <w:p>
@@ -3463,7 +3463,7 @@
           <w:sz w:val="22"/>
           <w:szCs w:val="22"/>
         </w:rPr>
-        <w:t xml:space="preserve">GUI block editor (GTK4/libadwaita or local web UI).</w:t>
+        <w:t>GUI block editor (local web UI).</w:t>
       </w:r>
     </w:p>
     <w:p>
@@ -4091,7 +4091,7 @@
           <w:sz w:val="22"/>
           <w:szCs w:val="22"/>
         </w:rPr>
-        <w:t xml:space="preserve">Check n8n, Node-RED, Huginn and Home Assistant automations first so CronJovi does not duplicate them.</w:t>
+        <w:t>Checked: n8n, Node-RED and Huginn do web work, and Home Assistant does devices. None targets the Wayland desktop.</w:t>
       </w:r>
     </w:p>
     <w:p>
@@ -4175,7 +4175,7 @@
           <w:sz w:val="22"/>
           <w:szCs w:val="22"/>
         </w:rPr>
-        <w:t xml:space="preserve">GTK4/libadwaita for a native feel versus a local web UI for speed of building.</w:t>
+        <w:t>Decided: a local web UI for speed of building, shown in a WebKitGTK window.</w:t>
       </w:r>
     </w:p>
     <w:sectPr>

</xml_diff>